<commit_message>
Add open-access links (San Damaso repository) to the 1602 Banez entry
The RET 79 (2019) edition of the Relacion is openly accessible in the
Repositorio institucional San Damaso (handle 123456789/2307, direct
PDF). Also linked: the 2022 chapter with the printed Valladolid
conclusions and the September 1602 letters (handle 1675), and 'Banez
y las tesis de Alcala: nuevos documentos' (handle 1641). Root README
source link updated; derivatives regenerated.

Co-Authored-By: Claude Fable 5 <noreply@anthropic.com>
Claude-Session: https://claude.ai/code/session_01EkKuzE7zQ3m7joz3G9Gvfo
</commit_message>
<xml_diff>
--- a/1602 Banez/1602_Banez_EN.docx
+++ b/1602 Banez/1602_Banez_EN.docx
@@ -2,7 +2,7 @@
 <file path=word/document.xml><?xml version="1.0" encoding="utf-8"?>
 <w:document xmlns:w="http://schemas.openxmlformats.org/wordprocessingml/2006/main" xmlns:m="http://schemas.openxmlformats.org/officeDocument/2006/math" xmlns:r="http://schemas.openxmlformats.org/officeDocument/2006/relationships" xmlns:o="urn:schemas-microsoft-com:office:office" xmlns:v="urn:schemas-microsoft-com:vml" xmlns:w10="urn:schemas-microsoft-com:office:word" xmlns:a="http://schemas.openxmlformats.org/drawingml/2006/main" xmlns:pic="http://schemas.openxmlformats.org/drawingml/2006/picture" xmlns:wp="http://schemas.openxmlformats.org/drawingml/2006/wordprocessingDrawing">
   <w:body>
-    <w:bookmarkStart w:id="21" w:name="X391a748d7da8ca48f133950c82674ddd6a7ae4a"/>
+    <w:bookmarkStart w:id="25" w:name="X391a748d7da8ca48f133950c82674ddd6a7ae4a"/>
     <w:p>
       <w:pPr>
         <w:pStyle w:val="Heading1"/>
@@ -173,29 +173,34 @@
         </w:rPr>
         <w:t xml:space="preserve"> </w:t>
       </w:r>
-      <w:r>
-        <w:rPr>
-          <w:iCs/>
-          <w:i/>
-          <w:bCs/>
-          <w:b/>
-        </w:rPr>
-        <w:t xml:space="preserve">Revista Española de Teología</w:t>
-      </w:r>
-      <w:r>
-        <w:rPr>
-          <w:bCs/>
-          <w:b/>
-        </w:rPr>
-        <w:t xml:space="preserve"> </w:t>
-      </w:r>
-      <w:r>
-        <w:rPr>
-          <w:bCs/>
-          <w:b/>
-        </w:rPr>
-        <w:t xml:space="preserve">79 (2019) 93–126</w:t>
-      </w:r>
+      <w:hyperlink r:id="rId20">
+        <w:r>
+          <w:rPr>
+            <w:rStyle w:val="Hyperlink"/>
+            <w:iCs/>
+            <w:i/>
+            <w:bCs/>
+            <w:b/>
+          </w:rPr>
+          <w:t xml:space="preserve">Revista Española de Teología</w:t>
+        </w:r>
+        <w:r>
+          <w:rPr>
+            <w:rStyle w:val="Hyperlink"/>
+            <w:bCs/>
+            <w:b/>
+          </w:rPr>
+          <w:t xml:space="preserve"> </w:t>
+        </w:r>
+        <w:r>
+          <w:rPr>
+            <w:rStyle w:val="Hyperlink"/>
+            <w:bCs/>
+            <w:b/>
+          </w:rPr>
+          <w:t xml:space="preserve">79 (2019) 93–126</w:t>
+        </w:r>
+      </w:hyperlink>
       <w:r>
         <w:t xml:space="preserve"> </w:t>
       </w:r>
@@ -231,7 +236,156 @@
           <w:iCs/>
           <w:i/>
         </w:rPr>
-        <w:t xml:space="preserve">English translation prepared from the Torrijos-Castrillejo edition (AI-assisted); Báñez’s Latin quotations retained with glosses.</w:t>
+        <w:t xml:space="preserve">Open access:</w:t>
+      </w:r>
+      <w:r>
+        <w:rPr>
+          <w:iCs/>
+          <w:i/>
+        </w:rPr>
+        <w:t xml:space="preserve"> </w:t>
+      </w:r>
+      <w:hyperlink r:id="rId21">
+        <w:r>
+          <w:rPr>
+            <w:rStyle w:val="Hyperlink"/>
+            <w:iCs/>
+            <w:i/>
+          </w:rPr>
+          <w:t xml:space="preserve">article PDF</w:t>
+        </w:r>
+      </w:hyperlink>
+      <w:r>
+        <w:rPr>
+          <w:iCs/>
+          <w:i/>
+        </w:rPr>
+        <w:t xml:space="preserve"> </w:t>
+      </w:r>
+      <w:r>
+        <w:rPr>
+          <w:iCs/>
+          <w:i/>
+        </w:rPr>
+        <w:t xml:space="preserve">—</w:t>
+      </w:r>
+      <w:r>
+        <w:rPr>
+          <w:iCs/>
+          <w:i/>
+        </w:rPr>
+        <w:t xml:space="preserve"> </w:t>
+      </w:r>
+      <w:hyperlink r:id="rId20">
+        <w:r>
+          <w:rPr>
+            <w:rStyle w:val="Hyperlink"/>
+            <w:iCs/>
+            <w:i/>
+          </w:rPr>
+          <w:t xml:space="preserve">item page</w:t>
+        </w:r>
+      </w:hyperlink>
+      <w:r>
+        <w:rPr>
+          <w:iCs/>
+          <w:i/>
+        </w:rPr>
+        <w:t xml:space="preserve"> </w:t>
+      </w:r>
+      <w:r>
+        <w:rPr>
+          <w:iCs/>
+          <w:i/>
+        </w:rPr>
+        <w:t xml:space="preserve">(Repositorio institucional San Dámaso). Related open-access studies by the same editor:</w:t>
+      </w:r>
+      <w:r>
+        <w:rPr>
+          <w:iCs/>
+          <w:i/>
+        </w:rPr>
+        <w:t xml:space="preserve"> </w:t>
+      </w:r>
+      <w:hyperlink r:id="rId22">
+        <w:r>
+          <w:rPr>
+            <w:rStyle w:val="Hyperlink"/>
+            <w:iCs/>
+            <w:i/>
+          </w:rPr>
+          <w:t xml:space="preserve">“</w:t>
+        </w:r>
+        <w:r>
+          <w:rPr>
+            <w:rStyle w:val="Hyperlink"/>
+            <w:iCs/>
+            <w:i/>
+          </w:rPr>
+          <w:t xml:space="preserve">Manuscritos inéditos de D. Báñez sobre las tesis de Alcalá (1602)</w:t>
+        </w:r>
+        <w:r>
+          <w:rPr>
+            <w:rStyle w:val="Hyperlink"/>
+            <w:iCs/>
+            <w:i/>
+          </w:rPr>
+          <w:t xml:space="preserve">”</w:t>
+        </w:r>
+      </w:hyperlink>
+      <w:r>
+        <w:rPr>
+          <w:iCs/>
+          <w:i/>
+        </w:rPr>
+        <w:t xml:space="preserve"> </w:t>
+      </w:r>
+      <w:r>
+        <w:rPr>
+          <w:iCs/>
+          <w:i/>
+        </w:rPr>
+        <w:t xml:space="preserve">— the edition of the printed Valladolid conclusions (Assertio 3ª) and the September 1602 letters — and</w:t>
+      </w:r>
+      <w:r>
+        <w:rPr>
+          <w:iCs/>
+          <w:i/>
+        </w:rPr>
+        <w:t xml:space="preserve"> </w:t>
+      </w:r>
+      <w:hyperlink r:id="rId23">
+        <w:r>
+          <w:rPr>
+            <w:rStyle w:val="Hyperlink"/>
+            <w:iCs/>
+            <w:i/>
+          </w:rPr>
+          <w:t xml:space="preserve">“</w:t>
+        </w:r>
+        <w:r>
+          <w:rPr>
+            <w:rStyle w:val="Hyperlink"/>
+            <w:iCs/>
+            <w:i/>
+          </w:rPr>
+          <w:t xml:space="preserve">Báñez y las tesis de Alcalá: nuevos documentos</w:t>
+        </w:r>
+        <w:r>
+          <w:rPr>
+            <w:rStyle w:val="Hyperlink"/>
+            <w:iCs/>
+            <w:i/>
+          </w:rPr>
+          <w:t xml:space="preserve">”</w:t>
+        </w:r>
+      </w:hyperlink>
+      <w:r>
+        <w:rPr>
+          <w:iCs/>
+          <w:i/>
+        </w:rPr>
+        <w:t xml:space="preserve">.</w:t>
       </w:r>
     </w:p>
     <w:p>
@@ -246,7 +400,7 @@
           <w:iCs/>
           <w:i/>
         </w:rPr>
-        <w:t xml:space="preserve">Last Edit: July 3, 2026.</w:t>
+        <w:t xml:space="preserve">English translation prepared from the Torrijos-Castrillejo edition (AI-assisted); Báñez’s Latin quotations retained with glosses.</w:t>
       </w:r>
     </w:p>
     <w:p>
@@ -261,7 +415,7 @@
           <w:iCs/>
           <w:i/>
         </w:rPr>
-        <w:t xml:space="preserve">Version: 1.0</w:t>
+        <w:t xml:space="preserve">Last Edit: July 3, 2026.</w:t>
       </w:r>
     </w:p>
     <w:p>
@@ -276,6 +430,21 @@
           <w:iCs/>
           <w:i/>
         </w:rPr>
+        <w:t xml:space="preserve">Version: 1.0</w:t>
+      </w:r>
+    </w:p>
+    <w:p>
+      <w:pPr>
+        <w:numPr>
+          <w:ilvl w:val="0"/>
+          <w:numId w:val="1001"/>
+        </w:numPr>
+      </w:pPr>
+      <w:r>
+        <w:rPr>
+          <w:iCs/>
+          <w:i/>
+        </w:rPr>
         <w:t xml:space="preserve">Selection: the complete Respuesta (Jesuit paragraphs P.1–P.15 in summary, Báñez’s replies R.1–R.15 in full)</w:t>
       </w:r>
     </w:p>
@@ -3484,7 +3653,7 @@
         </w:pict>
       </w:r>
     </w:p>
-    <w:bookmarkStart w:id="20" w:name="five-things-this-relación-settles"/>
+    <w:bookmarkStart w:id="24" w:name="five-things-this-relación-settles"/>
     <w:p>
       <w:pPr>
         <w:pStyle w:val="Heading2"/>
@@ -4035,8 +4204,8 @@
         <w:t xml:space="preserve">(R.13)</w:t>
       </w:r>
     </w:p>
-    <w:bookmarkEnd w:id="20"/>
-    <w:bookmarkEnd w:id="21"/>
+    <w:bookmarkEnd w:id="24"/>
+    <w:bookmarkEnd w:id="25"/>
     <w:sectPr/>
   </w:body>
 </w:document>

</xml_diff>